<commit_message>
Adicionar pedidos de feedback prontos para Ana e Andressa
Mensagens Teams/e-mail para Rafael Coloda, Jessica, Rafael Martins
e cobrança às mentoradas; rastreadores e Word em DOCS-PEOPLE-LEAD.

Co-authored-by: Jonatas Andrade <jonatasandradedeveloper@users.noreply.github.com>
</commit_message>
<xml_diff>
--- a/people-lead/word/00-dashboard.docx
+++ b/people-lead/word/00-dashboard.docx
@@ -1527,10 +1527,10 @@
         <w:rPr>
           <w:b/>
         </w:rPr>
-        <w:t>Input ABCD Form Ana — até 11/09</w:t>
+        <w:t>Feedbacks Ana</w:t>
       </w:r>
       <w:r>
-        <w:t xml:space="preserve"> (usar </w:t>
+        <w:t xml:space="preserve"> — Rafael Coloda + Jessica (msgs em </w:t>
       </w:r>
       <w:r>
         <w:rPr>
@@ -1538,7 +1538,7 @@
           <w:color w:val="333333"/>
           <w:sz w:val="18"/>
         </w:rPr>
-        <w:t>ana/11-dados-oficiais-rh-ciclo.md</w:t>
+        <w:t>14-pedidos-feedback-mentorados.md</w:t>
       </w:r>
       <w:r>
         <w:t>).</w:t>
@@ -1549,7 +1549,7 @@
         <w:pStyle w:val="ListNumber"/>
       </w:pPr>
       <w:r>
-        <w:t>Confirmar Ana submeteu autorreflexão (28/08); coletar feedback Jessica + Rafael Coloda.</w:t>
+        <w:t>Cobrar Ana: autorreflexão ABCD + pedidos de feedback no Workday.</w:t>
       </w:r>
     </w:p>
     <w:p>
@@ -1557,7 +1557,13 @@
         <w:pStyle w:val="ListNumber"/>
       </w:pPr>
       <w:r>
-        <w:t>Enviar material Copilot/PUG; agendar 1:1 #3 Ana (T/S/A).</w:t>
+        <w:rPr>
+          <w:b/>
+        </w:rPr>
+        <w:t>Feedbacks Andressa</w:t>
+      </w:r>
+      <w:r>
+        <w:t xml:space="preserve"> — pedir e-mail Rafael Martins; enviar pedido.</w:t>
       </w:r>
     </w:p>
     <w:p>
@@ -1565,7 +1571,13 @@
         <w:pStyle w:val="ListNumber"/>
       </w:pPr>
       <w:r>
-        <w:t>Marcar 1:1 fechamento Andressa (MAPFRE).</w:t>
+        <w:rPr>
+          <w:b/>
+        </w:rPr>
+        <w:t>Input ABCD Form Ana — até 11/09</w:t>
+      </w:r>
+      <w:r>
+        <w:t>.</w:t>
       </w:r>
     </w:p>
     <w:p>
@@ -1573,15 +1585,7 @@
         <w:pStyle w:val="ListNumber"/>
       </w:pPr>
       <w:r>
-        <w:t>Andressa: pedir e-mail Rafael Martins; 3 evidências sustentação.</w:t>
-      </w:r>
-    </w:p>
-    <w:p>
-      <w:pPr>
-        <w:pStyle w:val="ListNumber"/>
-      </w:pPr>
-      <w:r>
-        <w:t>Revisar autoavaliação Andressa antes do Workday.</w:t>
+        <w:t>Marcar 1:1 #3 Ana / 1:1 #2 Andressa.</w:t>
       </w:r>
     </w:p>
     <w:p>

</xml_diff>